<commit_message>
build: rebuild lab 2 report and presentation
</commit_message>
<xml_diff>
--- a/lab02/report/report.docx
+++ b/lab02/report/report.docx
@@ -162,7 +162,7 @@
       </w:r>
     </w:p>
     <w:bookmarkEnd w:id="22"/>
-    <w:bookmarkStart w:id="47" w:name="выполнение-лабораторной-работы"/>
+    <w:bookmarkStart w:id="41" w:name="выполнение-лабораторной-работы"/>
     <w:p>
       <w:pPr>
         <w:pStyle w:val="Heading1"/>
@@ -177,7 +177,6 @@
           <w:ilvl w:val="0"/>
           <w:numId w:val="1002"/>
         </w:numPr>
-        <w:pStyle w:val="Compact"/>
       </w:pPr>
       <w:r>
         <w:t xml:space="preserve">Создать файл</w:t>
@@ -197,14 +196,153 @@
     </w:p>
     <w:p>
       <w:pPr>
-        <w:pStyle w:val="CaptionedFigure"/>
+        <w:numPr>
+          <w:ilvl w:val="0"/>
+          <w:numId w:val="1002"/>
+        </w:numPr>
+      </w:pPr>
+      <w:r>
+        <w:t xml:space="preserve">Вставить в него простой LaTeX-документ с:</w:t>
+      </w:r>
+    </w:p>
+    <w:p>
+      <w:pPr>
+        <w:numPr>
+          <w:ilvl w:val="1"/>
+          <w:numId w:val="1003"/>
+        </w:numPr>
+        <w:pStyle w:val="Compact"/>
+      </w:pPr>
+      <w:r>
+        <w:rPr>
+          <w:rStyle w:val="VerbatimChar"/>
+        </w:rPr>
+        <w:t xml:space="preserve">\documentclass{article}</w:t>
+      </w:r>
+      <w:r>
+        <w:t xml:space="preserve">;</w:t>
+      </w:r>
+    </w:p>
+    <w:p>
+      <w:pPr>
+        <w:numPr>
+          <w:ilvl w:val="1"/>
+          <w:numId w:val="1003"/>
+        </w:numPr>
+        <w:pStyle w:val="Compact"/>
+      </w:pPr>
+      <w:r>
+        <w:rPr>
+          <w:rStyle w:val="VerbatimChar"/>
+        </w:rPr>
+        <w:t xml:space="preserve">\begin{document}</w:t>
+      </w:r>
+      <w:r>
+        <w:t xml:space="preserve">;</w:t>
+      </w:r>
+    </w:p>
+    <w:p>
+      <w:pPr>
+        <w:numPr>
+          <w:ilvl w:val="1"/>
+          <w:numId w:val="1003"/>
+        </w:numPr>
+        <w:pStyle w:val="Compact"/>
+      </w:pPr>
+      <w:r>
+        <w:t xml:space="preserve">текстом;</w:t>
+      </w:r>
+    </w:p>
+    <w:p>
+      <w:pPr>
+        <w:numPr>
+          <w:ilvl w:val="1"/>
+          <w:numId w:val="1003"/>
+        </w:numPr>
+        <w:pStyle w:val="Compact"/>
+      </w:pPr>
+      <w:r>
+        <w:rPr>
+          <w:rStyle w:val="VerbatimChar"/>
+        </w:rPr>
+        <w:t xml:space="preserve">\end{document}</w:t>
+      </w:r>
+      <w:r>
+        <w:t xml:space="preserve">.</w:t>
+      </w:r>
+    </w:p>
+    <w:p>
+      <w:pPr>
+        <w:numPr>
+          <w:ilvl w:val="0"/>
+          <w:numId w:val="1002"/>
+        </w:numPr>
+      </w:pPr>
+      <w:r>
+        <w:t xml:space="preserve">Скомпилировать:</w:t>
+      </w:r>
+    </w:p>
+    <w:p>
+      <w:pPr>
+        <w:pStyle w:val="SourceCode"/>
+      </w:pPr>
+      <w:r>
+        <w:rPr>
+          <w:rStyle w:val="ExtensionTok"/>
+        </w:rPr>
+        <w:t xml:space="preserve">pdflatex</w:t>
+      </w:r>
+      <w:r>
+        <w:rPr>
+          <w:rStyle w:val="NormalTok"/>
+        </w:rPr>
+        <w:t xml:space="preserve"> first.tex</w:t>
+      </w:r>
+    </w:p>
+    <w:p>
+      <w:pPr>
+        <w:numPr>
+          <w:ilvl w:val="0"/>
+          <w:numId w:val="1004"/>
+        </w:numPr>
+      </w:pPr>
+      <w:r>
+        <w:t xml:space="preserve">Получить</w:t>
+      </w:r>
+      <w:r>
+        <w:t xml:space="preserve"> </w:t>
+      </w:r>
+      <w:r>
+        <w:rPr>
+          <w:rStyle w:val="VerbatimChar"/>
+        </w:rPr>
+        <w:t xml:space="preserve">first.pdf</w:t>
+      </w:r>
+      <w:r>
+        <w:t xml:space="preserve">.</w:t>
+      </w:r>
+    </w:p>
+    <w:p>
+      <w:pPr>
+        <w:numPr>
+          <w:ilvl w:val="0"/>
+          <w:numId w:val="1004"/>
+        </w:numPr>
+      </w:pPr>
+      <w:r>
+        <w:t xml:space="preserve">Открыть и проверить PDF.</w:t>
+      </w:r>
+    </w:p>
+    <w:p>
+      <w:pPr>
+        <w:pStyle w:val="FirstParagraph"/>
       </w:pPr>
       <w:r>
         <w:drawing>
           <wp:inline>
             <wp:extent cx="3670388" cy="2647283"/>
             <wp:effectExtent b="0" l="0" r="0" t="0"/>
-            <wp:docPr descr="Рис.1" title="" id="24" name="Picture"/>
+            <wp:docPr descr="" title="" id="24" name="Picture"/>
             <a:graphic>
               <a:graphicData uri="http://schemas.openxmlformats.org/drawingml/2006/picture">
                 <pic:pic>
@@ -244,37 +382,47 @@
     </w:p>
     <w:p>
       <w:pPr>
-        <w:pStyle w:val="ImageCaption"/>
-      </w:pPr>
-      <w:r>
-        <w:t xml:space="preserve">Рис.1</w:t>
-      </w:r>
-    </w:p>
-    <w:p>
-      <w:pPr>
         <w:numPr>
           <w:ilvl w:val="0"/>
-          <w:numId w:val="1003"/>
+          <w:numId w:val="1005"/>
         </w:numPr>
         <w:pStyle w:val="Compact"/>
       </w:pPr>
       <w:r>
-        <w:t xml:space="preserve">Вставить в него простой LaTeX-документ с:</w:t>
+        <w:t xml:space="preserve">Разобраться, что такое:</w:t>
       </w:r>
     </w:p>
     <w:p>
       <w:pPr>
         <w:numPr>
           <w:ilvl w:val="1"/>
-          <w:numId w:val="1004"/>
+          <w:numId w:val="1006"/>
         </w:numPr>
         <w:pStyle w:val="Compact"/>
       </w:pPr>
+      <w:r>
+        <w:t xml:space="preserve">команда LaTeX;</w:t>
+      </w:r>
+    </w:p>
+    <w:p>
+      <w:pPr>
+        <w:numPr>
+          <w:ilvl w:val="1"/>
+          <w:numId w:val="1006"/>
+        </w:numPr>
+        <w:pStyle w:val="Compact"/>
+      </w:pPr>
+      <w:r>
+        <w:t xml:space="preserve">обязательные аргументы</w:t>
+      </w:r>
+      <w:r>
+        <w:t xml:space="preserve"> </w:t>
+      </w:r>
       <w:r>
         <w:rPr>
           <w:rStyle w:val="VerbatimChar"/>
         </w:rPr>
-        <w:t xml:space="preserve">\documentclass{article}</w:t>
+        <w:t xml:space="preserve">{}</w:t>
       </w:r>
       <w:r>
         <w:t xml:space="preserve">;</w:t>
@@ -284,15 +432,21 @@
       <w:pPr>
         <w:numPr>
           <w:ilvl w:val="1"/>
-          <w:numId w:val="1004"/>
+          <w:numId w:val="1006"/>
         </w:numPr>
         <w:pStyle w:val="Compact"/>
       </w:pPr>
+      <w:r>
+        <w:t xml:space="preserve">необязательные аргументы</w:t>
+      </w:r>
+      <w:r>
+        <w:t xml:space="preserve"> </w:t>
+      </w:r>
       <w:r>
         <w:rPr>
           <w:rStyle w:val="VerbatimChar"/>
         </w:rPr>
-        <w:t xml:space="preserve">\begin{document}</w:t>
+        <w:t xml:space="preserve">[]</w:t>
       </w:r>
       <w:r>
         <w:t xml:space="preserve">;</w:t>
@@ -302,27 +456,60 @@
       <w:pPr>
         <w:numPr>
           <w:ilvl w:val="1"/>
-          <w:numId w:val="1004"/>
+          <w:numId w:val="1006"/>
         </w:numPr>
         <w:pStyle w:val="Compact"/>
       </w:pPr>
       <w:r>
-        <w:t xml:space="preserve">текстом;</w:t>
+        <w:t xml:space="preserve">преамбула;</w:t>
       </w:r>
     </w:p>
     <w:p>
       <w:pPr>
         <w:numPr>
           <w:ilvl w:val="1"/>
-          <w:numId w:val="1004"/>
+          <w:numId w:val="1006"/>
         </w:numPr>
         <w:pStyle w:val="Compact"/>
       </w:pPr>
+      <w:r>
+        <w:t xml:space="preserve">тело документа;</w:t>
+      </w:r>
+    </w:p>
+    <w:p>
+      <w:pPr>
+        <w:numPr>
+          <w:ilvl w:val="1"/>
+          <w:numId w:val="1006"/>
+        </w:numPr>
+        <w:pStyle w:val="Compact"/>
+      </w:pPr>
+      <w:r>
+        <w:t xml:space="preserve">окружения</w:t>
+      </w:r>
+      <w:r>
+        <w:t xml:space="preserve"> </w:t>
+      </w:r>
       <w:r>
         <w:rPr>
           <w:rStyle w:val="VerbatimChar"/>
         </w:rPr>
-        <w:t xml:space="preserve">\end{document}</w:t>
+        <w:t xml:space="preserve">\begin{...}</w:t>
+      </w:r>
+      <w:r>
+        <w:t xml:space="preserve"> </w:t>
+      </w:r>
+      <w:r>
+        <w:t xml:space="preserve">/</w:t>
+      </w:r>
+      <w:r>
+        <w:t xml:space="preserve"> </w:t>
+      </w:r>
+      <w:r>
+        <w:rPr>
+          <w:rStyle w:val="VerbatimChar"/>
+        </w:rPr>
+        <w:t xml:space="preserve">\end{...}</w:t>
       </w:r>
       <w:r>
         <w:t xml:space="preserve">.</w:t>
@@ -330,188 +517,49 @@
     </w:p>
     <w:p>
       <w:pPr>
-        <w:pStyle w:val="CaptionedFigure"/>
+        <w:numPr>
+          <w:ilvl w:val="0"/>
+          <w:numId w:val="1005"/>
+        </w:numPr>
+        <w:pStyle w:val="Compact"/>
+      </w:pPr>
+      <w:r>
+        <w:t xml:space="preserve">Научиться использовать комментарии</w:t>
+      </w:r>
+      <w:r>
+        <w:t xml:space="preserve"> </w:t>
+      </w:r>
+      <w:r>
+        <w:rPr>
+          <w:rStyle w:val="VerbatimChar"/>
+        </w:rPr>
+        <w:t xml:space="preserve">%</w:t>
+      </w:r>
+      <w:r>
+        <w:t xml:space="preserve">.</w:t>
+      </w:r>
+    </w:p>
+    <w:p>
+      <w:pPr>
+        <w:pStyle w:val="FirstParagraph"/>
       </w:pPr>
       <w:r>
         <w:drawing>
           <wp:inline>
-            <wp:extent cx="4482478" cy="3082103"/>
+            <wp:extent cx="4111602" cy="2621706"/>
             <wp:effectExtent b="0" l="0" r="0" t="0"/>
-            <wp:docPr descr="Рис.2" title="" id="27" name="Picture"/>
+            <wp:docPr descr="" title="" id="27" name="Picture"/>
             <a:graphic>
               <a:graphicData uri="http://schemas.openxmlformats.org/drawingml/2006/picture">
                 <pic:pic>
                   <pic:nvPicPr>
-                    <pic:cNvPr descr="image/2.png" id="28" name="Picture"/>
+                    <pic:cNvPr descr="image/4.png" id="28" name="Picture"/>
                     <pic:cNvPicPr>
                       <a:picLocks noChangeArrowheads="1" noChangeAspect="1"/>
                     </pic:cNvPicPr>
                   </pic:nvPicPr>
                   <pic:blipFill>
                     <a:blip r:embed="rId26"/>
-                    <a:stretch>
-                      <a:fillRect/>
-                    </a:stretch>
-                  </pic:blipFill>
-                  <pic:spPr bwMode="auto">
-                    <a:xfrm>
-                      <a:off x="0" y="0"/>
-                      <a:ext cx="4482478" cy="3082103"/>
-                    </a:xfrm>
-                    <a:prstGeom prst="rect">
-                      <a:avLst/>
-                    </a:prstGeom>
-                    <a:noFill/>
-                    <a:ln w="9525">
-                      <a:noFill/>
-                      <a:headEnd/>
-                      <a:tailEnd/>
-                    </a:ln>
-                  </pic:spPr>
-                </pic:pic>
-              </a:graphicData>
-            </a:graphic>
-          </wp:inline>
-        </w:drawing>
-      </w:r>
-    </w:p>
-    <w:p>
-      <w:pPr>
-        <w:pStyle w:val="ImageCaption"/>
-      </w:pPr>
-      <w:r>
-        <w:t xml:space="preserve">Рис.2</w:t>
-      </w:r>
-    </w:p>
-    <w:p>
-      <w:pPr>
-        <w:numPr>
-          <w:ilvl w:val="0"/>
-          <w:numId w:val="1005"/>
-        </w:numPr>
-        <w:pStyle w:val="Compact"/>
-      </w:pPr>
-      <w:r>
-        <w:t xml:space="preserve">Скомпилировать:</w:t>
-      </w:r>
-    </w:p>
-    <w:p>
-      <w:pPr>
-        <w:pStyle w:val="SourceCode"/>
-      </w:pPr>
-      <w:r>
-        <w:rPr>
-          <w:rStyle w:val="ExtensionTok"/>
-        </w:rPr>
-        <w:t xml:space="preserve">pdflatex</w:t>
-      </w:r>
-      <w:r>
-        <w:rPr>
-          <w:rStyle w:val="NormalTok"/>
-        </w:rPr>
-        <w:t xml:space="preserve"> first.tex</w:t>
-      </w:r>
-    </w:p>
-    <w:p>
-      <w:pPr>
-        <w:pStyle w:val="CaptionedFigure"/>
-      </w:pPr>
-      <w:r>
-        <w:drawing>
-          <wp:inline>
-            <wp:extent cx="4335406" cy="2346746"/>
-            <wp:effectExtent b="0" l="0" r="0" t="0"/>
-            <wp:docPr descr="Рис.3" title="" id="30" name="Picture"/>
-            <a:graphic>
-              <a:graphicData uri="http://schemas.openxmlformats.org/drawingml/2006/picture">
-                <pic:pic>
-                  <pic:nvPicPr>
-                    <pic:cNvPr descr="image/3.png" id="31" name="Picture"/>
-                    <pic:cNvPicPr>
-                      <a:picLocks noChangeArrowheads="1" noChangeAspect="1"/>
-                    </pic:cNvPicPr>
-                  </pic:nvPicPr>
-                  <pic:blipFill>
-                    <a:blip r:embed="rId29"/>
-                    <a:stretch>
-                      <a:fillRect/>
-                    </a:stretch>
-                  </pic:blipFill>
-                  <pic:spPr bwMode="auto">
-                    <a:xfrm>
-                      <a:off x="0" y="0"/>
-                      <a:ext cx="4335406" cy="2346746"/>
-                    </a:xfrm>
-                    <a:prstGeom prst="rect">
-                      <a:avLst/>
-                    </a:prstGeom>
-                    <a:noFill/>
-                    <a:ln w="9525">
-                      <a:noFill/>
-                      <a:headEnd/>
-                      <a:tailEnd/>
-                    </a:ln>
-                  </pic:spPr>
-                </pic:pic>
-              </a:graphicData>
-            </a:graphic>
-          </wp:inline>
-        </w:drawing>
-      </w:r>
-    </w:p>
-    <w:p>
-      <w:pPr>
-        <w:pStyle w:val="ImageCaption"/>
-      </w:pPr>
-      <w:r>
-        <w:t xml:space="preserve">Рис.3</w:t>
-      </w:r>
-    </w:p>
-    <w:p>
-      <w:pPr>
-        <w:numPr>
-          <w:ilvl w:val="0"/>
-          <w:numId w:val="1006"/>
-        </w:numPr>
-        <w:pStyle w:val="Compact"/>
-      </w:pPr>
-      <w:r>
-        <w:t xml:space="preserve">Получить</w:t>
-      </w:r>
-      <w:r>
-        <w:t xml:space="preserve"> </w:t>
-      </w:r>
-      <w:r>
-        <w:rPr>
-          <w:rStyle w:val="VerbatimChar"/>
-        </w:rPr>
-        <w:t xml:space="preserve">first.pdf</w:t>
-      </w:r>
-      <w:r>
-        <w:t xml:space="preserve">.</w:t>
-      </w:r>
-    </w:p>
-    <w:p>
-      <w:pPr>
-        <w:pStyle w:val="CaptionedFigure"/>
-      </w:pPr>
-      <w:r>
-        <w:drawing>
-          <wp:inline>
-            <wp:extent cx="4111602" cy="2621706"/>
-            <wp:effectExtent b="0" l="0" r="0" t="0"/>
-            <wp:docPr descr="Рис.4" title="" id="33" name="Picture"/>
-            <a:graphic>
-              <a:graphicData uri="http://schemas.openxmlformats.org/drawingml/2006/picture">
-                <pic:pic>
-                  <pic:nvPicPr>
-                    <pic:cNvPr descr="image/4.png" id="34" name="Picture"/>
-                    <pic:cNvPicPr>
-                      <a:picLocks noChangeArrowheads="1" noChangeAspect="1"/>
-                    </pic:cNvPicPr>
-                  </pic:nvPicPr>
-                  <pic:blipFill>
-                    <a:blip r:embed="rId32"/>
                     <a:stretch>
                       <a:fillRect/>
                     </a:stretch>
@@ -540,14 +588,6 @@
     </w:p>
     <w:p>
       <w:pPr>
-        <w:pStyle w:val="ImageCaption"/>
-      </w:pPr>
-      <w:r>
-        <w:t xml:space="preserve">Рис.4</w:t>
-      </w:r>
-    </w:p>
-    <w:p>
-      <w:pPr>
         <w:numPr>
           <w:ilvl w:val="0"/>
           <w:numId w:val="1007"/>
@@ -555,30 +595,30 @@
         <w:pStyle w:val="Compact"/>
       </w:pPr>
       <w:r>
-        <w:t xml:space="preserve">Открыть и проверить PDF.</w:t>
-      </w:r>
-    </w:p>
-    <w:p>
-      <w:pPr>
-        <w:pStyle w:val="CaptionedFigure"/>
+        <w:t xml:space="preserve">Научиться разделять текст на абзацы.</w:t>
+      </w:r>
+    </w:p>
+    <w:p>
+      <w:pPr>
+        <w:pStyle w:val="FirstParagraph"/>
       </w:pPr>
       <w:r>
         <w:drawing>
           <wp:inline>
             <wp:extent cx="3203597" cy="2103759"/>
             <wp:effectExtent b="0" l="0" r="0" t="0"/>
-            <wp:docPr descr="Рис.5" title="" id="36" name="Picture"/>
+            <wp:docPr descr="" title="" id="30" name="Picture"/>
             <a:graphic>
               <a:graphicData uri="http://schemas.openxmlformats.org/drawingml/2006/picture">
                 <pic:pic>
                   <pic:nvPicPr>
-                    <pic:cNvPr descr="image/5.png" id="37" name="Picture"/>
+                    <pic:cNvPr descr="image/5.png" id="31" name="Picture"/>
                     <pic:cNvPicPr>
                       <a:picLocks noChangeArrowheads="1" noChangeAspect="1"/>
                     </pic:cNvPicPr>
                   </pic:nvPicPr>
                   <pic:blipFill>
-                    <a:blip r:embed="rId35"/>
+                    <a:blip r:embed="rId29"/>
                     <a:stretch>
                       <a:fillRect/>
                     </a:stretch>
@@ -607,14 +647,6 @@
     </w:p>
     <w:p>
       <w:pPr>
-        <w:pStyle w:val="ImageCaption"/>
-      </w:pPr>
-      <w:r>
-        <w:t xml:space="preserve">Рис.5</w:t>
-      </w:r>
-    </w:p>
-    <w:p>
-      <w:pPr>
         <w:numPr>
           <w:ilvl w:val="0"/>
           <w:numId w:val="1008"/>
@@ -622,31 +654,7 @@
         <w:pStyle w:val="Compact"/>
       </w:pPr>
       <w:r>
-        <w:t xml:space="preserve">Разобраться, что такое:</w:t>
-      </w:r>
-    </w:p>
-    <w:p>
-      <w:pPr>
-        <w:numPr>
-          <w:ilvl w:val="1"/>
-          <w:numId w:val="1009"/>
-        </w:numPr>
-        <w:pStyle w:val="Compact"/>
-      </w:pPr>
-      <w:r>
-        <w:t xml:space="preserve">команда LaTeX;</w:t>
-      </w:r>
-    </w:p>
-    <w:p>
-      <w:pPr>
-        <w:numPr>
-          <w:ilvl w:val="1"/>
-          <w:numId w:val="1009"/>
-        </w:numPr>
-        <w:pStyle w:val="Compact"/>
-      </w:pPr>
-      <w:r>
-        <w:t xml:space="preserve">обязательные аргументы</w:t>
+        <w:t xml:space="preserve">Проверить работу обычных и неразрывных пробелов</w:t>
       </w:r>
       <w:r>
         <w:t xml:space="preserve"> </w:t>
@@ -655,94 +663,7 @@
         <w:rPr>
           <w:rStyle w:val="VerbatimChar"/>
         </w:rPr>
-        <w:t xml:space="preserve">{}</w:t>
-      </w:r>
-      <w:r>
-        <w:t xml:space="preserve">;</w:t>
-      </w:r>
-    </w:p>
-    <w:p>
-      <w:pPr>
-        <w:numPr>
-          <w:ilvl w:val="1"/>
-          <w:numId w:val="1009"/>
-        </w:numPr>
-        <w:pStyle w:val="Compact"/>
-      </w:pPr>
-      <w:r>
-        <w:t xml:space="preserve">необязательные аргументы</w:t>
-      </w:r>
-      <w:r>
-        <w:t xml:space="preserve"> </w:t>
-      </w:r>
-      <w:r>
-        <w:rPr>
-          <w:rStyle w:val="VerbatimChar"/>
-        </w:rPr>
-        <w:t xml:space="preserve">[]</w:t>
-      </w:r>
-      <w:r>
-        <w:t xml:space="preserve">;</w:t>
-      </w:r>
-    </w:p>
-    <w:p>
-      <w:pPr>
-        <w:numPr>
-          <w:ilvl w:val="1"/>
-          <w:numId w:val="1009"/>
-        </w:numPr>
-        <w:pStyle w:val="Compact"/>
-      </w:pPr>
-      <w:r>
-        <w:t xml:space="preserve">преамбула;</w:t>
-      </w:r>
-    </w:p>
-    <w:p>
-      <w:pPr>
-        <w:numPr>
-          <w:ilvl w:val="1"/>
-          <w:numId w:val="1009"/>
-        </w:numPr>
-        <w:pStyle w:val="Compact"/>
-      </w:pPr>
-      <w:r>
-        <w:t xml:space="preserve">тело документа;</w:t>
-      </w:r>
-    </w:p>
-    <w:p>
-      <w:pPr>
-        <w:numPr>
-          <w:ilvl w:val="1"/>
-          <w:numId w:val="1009"/>
-        </w:numPr>
-        <w:pStyle w:val="Compact"/>
-      </w:pPr>
-      <w:r>
-        <w:t xml:space="preserve">окружения</w:t>
-      </w:r>
-      <w:r>
-        <w:t xml:space="preserve"> </w:t>
-      </w:r>
-      <w:r>
-        <w:rPr>
-          <w:rStyle w:val="VerbatimChar"/>
-        </w:rPr>
-        <w:t xml:space="preserve">\begin{...}</w:t>
-      </w:r>
-      <w:r>
-        <w:t xml:space="preserve"> </w:t>
-      </w:r>
-      <w:r>
-        <w:t xml:space="preserve">/</w:t>
-      </w:r>
-      <w:r>
-        <w:t xml:space="preserve"> </w:t>
-      </w:r>
-      <w:r>
-        <w:rPr>
-          <w:rStyle w:val="VerbatimChar"/>
-        </w:rPr>
-        <w:t xml:space="preserve">\end{...}</w:t>
+        <w:t xml:space="preserve">~</w:t>
       </w:r>
       <w:r>
         <w:t xml:space="preserve">.</w:t>
@@ -750,25 +671,25 @@
     </w:p>
     <w:p>
       <w:pPr>
-        <w:pStyle w:val="CaptionedFigure"/>
+        <w:pStyle w:val="FirstParagraph"/>
       </w:pPr>
       <w:r>
         <w:drawing>
           <wp:inline>
             <wp:extent cx="2423479" cy="1355613"/>
             <wp:effectExtent b="0" l="0" r="0" t="0"/>
-            <wp:docPr descr="Рис.6" title="" id="39" name="Picture"/>
+            <wp:docPr descr="" title="" id="33" name="Picture"/>
             <a:graphic>
               <a:graphicData uri="http://schemas.openxmlformats.org/drawingml/2006/picture">
                 <pic:pic>
                   <pic:nvPicPr>
-                    <pic:cNvPr descr="image/6.png" id="40" name="Picture"/>
+                    <pic:cNvPr descr="image/6.png" id="34" name="Picture"/>
                     <pic:cNvPicPr>
                       <a:picLocks noChangeArrowheads="1" noChangeAspect="1"/>
                     </pic:cNvPicPr>
                   </pic:nvPicPr>
                   <pic:blipFill>
-                    <a:blip r:embed="rId38"/>
+                    <a:blip r:embed="rId32"/>
                     <a:stretch>
                       <a:fillRect/>
                     </a:stretch>
@@ -797,57 +718,79 @@
     </w:p>
     <w:p>
       <w:pPr>
-        <w:pStyle w:val="ImageCaption"/>
-      </w:pPr>
-      <w:r>
-        <w:t xml:space="preserve">Рис.6</w:t>
-      </w:r>
-    </w:p>
-    <w:p>
-      <w:pPr>
         <w:numPr>
           <w:ilvl w:val="0"/>
-          <w:numId w:val="1010"/>
+          <w:numId w:val="1009"/>
         </w:numPr>
         <w:pStyle w:val="Compact"/>
       </w:pPr>
       <w:r>
-        <w:t xml:space="preserve">Научиться использовать комментарии</w:t>
-      </w:r>
-      <w:r>
-        <w:t xml:space="preserve"> </w:t>
-      </w:r>
+        <w:t xml:space="preserve">Научиться запускать LaTeX из терминала:</w:t>
+      </w:r>
+    </w:p>
+    <w:p>
+      <w:pPr>
+        <w:pStyle w:val="SourceCode"/>
+      </w:pPr>
       <w:r>
         <w:rPr>
-          <w:rStyle w:val="VerbatimChar"/>
+          <w:rStyle w:val="ExtensionTok"/>
         </w:rPr>
-        <w:t xml:space="preserve">%</w:t>
-      </w:r>
-      <w:r>
-        <w:t xml:space="preserve">.</w:t>
-      </w:r>
-    </w:p>
-    <w:p>
-      <w:pPr>
-        <w:pStyle w:val="CaptionedFigure"/>
+        <w:t xml:space="preserve">pdflatex</w:t>
+      </w:r>
+      <w:r>
+        <w:rPr>
+          <w:rStyle w:val="NormalTok"/>
+        </w:rPr>
+        <w:t xml:space="preserve"> first</w:t>
+      </w:r>
+    </w:p>
+    <w:p>
+      <w:pPr>
+        <w:pStyle w:val="FirstParagraph"/>
+      </w:pPr>
+      <w:r>
+        <w:t xml:space="preserve">или</w:t>
+      </w:r>
+    </w:p>
+    <w:p>
+      <w:pPr>
+        <w:pStyle w:val="SourceCode"/>
+      </w:pPr>
+      <w:r>
+        <w:rPr>
+          <w:rStyle w:val="ExtensionTok"/>
+        </w:rPr>
+        <w:t xml:space="preserve">pdflatex</w:t>
+      </w:r>
+      <w:r>
+        <w:rPr>
+          <w:rStyle w:val="NormalTok"/>
+        </w:rPr>
+        <w:t xml:space="preserve"> first.tex</w:t>
+      </w:r>
+    </w:p>
+    <w:p>
+      <w:pPr>
+        <w:pStyle w:val="FirstParagraph"/>
       </w:pPr>
       <w:r>
         <w:drawing>
           <wp:inline>
             <wp:extent cx="5334000" cy="4682066"/>
             <wp:effectExtent b="0" l="0" r="0" t="0"/>
-            <wp:docPr descr="Рис.7" title="" id="42" name="Picture"/>
+            <wp:docPr descr="" title="" id="36" name="Picture"/>
             <a:graphic>
               <a:graphicData uri="http://schemas.openxmlformats.org/drawingml/2006/picture">
                 <pic:pic>
                   <pic:nvPicPr>
-                    <pic:cNvPr descr="image/7.png" id="43" name="Picture"/>
+                    <pic:cNvPr descr="image/7.png" id="37" name="Picture"/>
                     <pic:cNvPicPr>
                       <a:picLocks noChangeArrowheads="1" noChangeAspect="1"/>
                     </pic:cNvPicPr>
                   </pic:nvPicPr>
                   <pic:blipFill>
-                    <a:blip r:embed="rId41"/>
+                    <a:blip r:embed="rId35"/>
                     <a:stretch>
                       <a:fillRect/>
                     </a:stretch>
@@ -876,45 +819,157 @@
     </w:p>
     <w:p>
       <w:pPr>
-        <w:pStyle w:val="ImageCaption"/>
-      </w:pPr>
-      <w:r>
-        <w:t xml:space="preserve">Рис.7</w:t>
-      </w:r>
-    </w:p>
-    <w:p>
-      <w:pPr>
         <w:numPr>
           <w:ilvl w:val="0"/>
-          <w:numId w:val="1011"/>
+          <w:numId w:val="1010"/>
         </w:numPr>
         <w:pStyle w:val="Compact"/>
       </w:pPr>
       <w:r>
-        <w:t xml:space="preserve">Научиться разделять текст на абзацы.</w:t>
-      </w:r>
-    </w:p>
-    <w:p>
-      <w:pPr>
-        <w:pStyle w:val="CaptionedFigure"/>
+        <w:t xml:space="preserve">Освоить специальные символы LaTeX:</w:t>
+      </w:r>
+      <w:r>
+        <w:t xml:space="preserve"> </w:t>
+      </w:r>
+      <w:r>
+        <w:rPr>
+          <w:rStyle w:val="VerbatimChar"/>
+        </w:rPr>
+        <w:t xml:space="preserve">{</w:t>
+      </w:r>
+      <w:r>
+        <w:t xml:space="preserve">,</w:t>
+      </w:r>
+      <w:r>
+        <w:t xml:space="preserve"> </w:t>
+      </w:r>
+      <w:r>
+        <w:rPr>
+          <w:rStyle w:val="VerbatimChar"/>
+        </w:rPr>
+        <w:t xml:space="preserve">}</w:t>
+      </w:r>
+      <w:r>
+        <w:t xml:space="preserve">,</w:t>
+      </w:r>
+      <w:r>
+        <w:t xml:space="preserve"> </w:t>
+      </w:r>
+      <w:r>
+        <w:rPr>
+          <w:rStyle w:val="VerbatimChar"/>
+        </w:rPr>
+        <w:t xml:space="preserve">$</w:t>
+      </w:r>
+      <w:r>
+        <w:t xml:space="preserve">,</w:t>
+      </w:r>
+      <w:r>
+        <w:t xml:space="preserve"> </w:t>
+      </w:r>
+      <w:r>
+        <w:rPr>
+          <w:rStyle w:val="VerbatimChar"/>
+        </w:rPr>
+        <w:t xml:space="preserve">%</w:t>
+      </w:r>
+      <w:r>
+        <w:t xml:space="preserve">,</w:t>
+      </w:r>
+      <w:r>
+        <w:t xml:space="preserve"> </w:t>
+      </w:r>
+      <w:r>
+        <w:rPr>
+          <w:rStyle w:val="VerbatimChar"/>
+        </w:rPr>
+        <w:t xml:space="preserve">&amp;</w:t>
+      </w:r>
+      <w:r>
+        <w:t xml:space="preserve">,</w:t>
+      </w:r>
+      <w:r>
+        <w:t xml:space="preserve"> </w:t>
+      </w:r>
+      <w:r>
+        <w:rPr>
+          <w:rStyle w:val="VerbatimChar"/>
+        </w:rPr>
+        <w:t xml:space="preserve">#</w:t>
+      </w:r>
+      <w:r>
+        <w:t xml:space="preserve">,</w:t>
+      </w:r>
+      <w:r>
+        <w:t xml:space="preserve"> </w:t>
+      </w:r>
+      <w:r>
+        <w:rPr>
+          <w:rStyle w:val="VerbatimChar"/>
+        </w:rPr>
+        <w:t xml:space="preserve">_</w:t>
+      </w:r>
+      <w:r>
+        <w:t xml:space="preserve">,</w:t>
+      </w:r>
+      <w:r>
+        <w:t xml:space="preserve"> </w:t>
+      </w:r>
+      <w:r>
+        <w:rPr>
+          <w:rStyle w:val="VerbatimChar"/>
+        </w:rPr>
+        <w:t xml:space="preserve">\</w:t>
+      </w:r>
+      <w:r>
+        <w:t xml:space="preserve">,</w:t>
+      </w:r>
+      <w:r>
+        <w:t xml:space="preserve"> </w:t>
+      </w:r>
+      <w:r>
+        <w:rPr>
+          <w:rStyle w:val="VerbatimChar"/>
+        </w:rPr>
+        <w:t xml:space="preserve">^</w:t>
+      </w:r>
+      <w:r>
+        <w:t xml:space="preserve">,</w:t>
+      </w:r>
+      <w:r>
+        <w:t xml:space="preserve"> </w:t>
+      </w:r>
+      <w:r>
+        <w:rPr>
+          <w:rStyle w:val="VerbatimChar"/>
+        </w:rPr>
+        <w:t xml:space="preserve">~</w:t>
+      </w:r>
+      <w:r>
+        <w:t xml:space="preserve">.</w:t>
+      </w:r>
+    </w:p>
+    <w:p>
+      <w:pPr>
+        <w:pStyle w:val="FirstParagraph"/>
       </w:pPr>
       <w:r>
         <w:drawing>
           <wp:inline>
             <wp:extent cx="2698439" cy="3069314"/>
             <wp:effectExtent b="0" l="0" r="0" t="0"/>
-            <wp:docPr descr="Рис.8" title="" id="45" name="Picture"/>
+            <wp:docPr descr="" title="" id="39" name="Picture"/>
             <a:graphic>
               <a:graphicData uri="http://schemas.openxmlformats.org/drawingml/2006/picture">
                 <pic:pic>
                   <pic:nvPicPr>
-                    <pic:cNvPr descr="image/8.png" id="46" name="Picture"/>
+                    <pic:cNvPr descr="image/8.png" id="40" name="Picture"/>
                     <pic:cNvPicPr>
                       <a:picLocks noChangeArrowheads="1" noChangeAspect="1"/>
                     </pic:cNvPicPr>
                   </pic:nvPicPr>
                   <pic:blipFill>
-                    <a:blip r:embed="rId44"/>
+                    <a:blip r:embed="rId38"/>
                     <a:stretch>
                       <a:fillRect/>
                     </a:stretch>
@@ -941,98 +996,14 @@
         </w:drawing>
       </w:r>
     </w:p>
-    <w:p>
-      <w:pPr>
-        <w:pStyle w:val="ImageCaption"/>
-      </w:pPr>
-      <w:r>
-        <w:t xml:space="preserve">Рис.8</w:t>
-      </w:r>
-    </w:p>
-    <w:p>
-      <w:pPr>
-        <w:numPr>
-          <w:ilvl w:val="0"/>
-          <w:numId w:val="1012"/>
-        </w:numPr>
-        <w:pStyle w:val="Compact"/>
-      </w:pPr>
-      <w:r>
-        <w:t xml:space="preserve">Проверить работу обычных и неразрывных пробелов</w:t>
-      </w:r>
-      <w:r>
-        <w:t xml:space="preserve"> </w:t>
-      </w:r>
-      <w:r>
-        <w:rPr>
-          <w:rStyle w:val="VerbatimChar"/>
-        </w:rPr>
-        <w:t xml:space="preserve">~</w:t>
-      </w:r>
-      <w:r>
-        <w:t xml:space="preserve">.</w:t>
-      </w:r>
-    </w:p>
-    <w:tbl>
-      <w:tblPr>
-        <w:tblStyle w:val="FigureTable"/>
-        <w:tblW w:type="auto" w:w="0"/>
-        <w:tblLook w:firstRow="0" w:lastRow="0" w:firstColumn="0" w:lastColumn="0"/>
-        <w:jc w:val="center"/>
-      </w:tblPr>
-      <w:tblGrid>
-        <w:gridCol w:w="7920"/>
-      </w:tblGrid>
-      <w:tr>
-        <w:tc>
-          <w:tcPr/>
-          <w:p>
-            <w:pPr>
-              <w:pStyle w:val="Compact"/>
-              <w:jc w:val="center"/>
-            </w:pPr>
-            <w:r>
-              <w:t xml:space="preserve">Рис.9</w:t>
-            </w:r>
-          </w:p>
-        </w:tc>
-      </w:tr>
-    </w:tbl>
-    <w:p>
-      <w:pPr>
-        <w:pStyle w:val="ImageCaption"/>
-      </w:pPr>
-      <w:r>
-        <w:t xml:space="preserve">Рис.9</w:t>
-      </w:r>
-    </w:p>
-    <w:p>
-      <w:pPr>
-        <w:numPr>
-          <w:ilvl w:val="0"/>
-          <w:numId w:val="1013"/>
-        </w:numPr>
-        <w:pStyle w:val="Compact"/>
-      </w:pPr>
-      <w:r>
-        <w:t xml:space="preserve">Научиться запускать LaTeX из терминала:</w:t>
-      </w:r>
-    </w:p>
-    <w:p>
-      <w:pPr>
-        <w:pStyle w:val="SourceCode"/>
-      </w:pPr>
-      <w:r>
-        <w:rPr>
-          <w:rStyle w:val="ExtensionTok"/>
-        </w:rPr>
-        <w:t xml:space="preserve">pdflatex</w:t>
-      </w:r>
-      <w:r>
-        <w:rPr>
-          <w:rStyle w:val="NormalTok"/>
-        </w:rPr>
-        <w:t xml:space="preserve"> first</w:t>
+    <w:bookmarkEnd w:id="41"/>
+    <w:bookmarkStart w:id="42" w:name="выводы"/>
+    <w:p>
+      <w:pPr>
+        <w:pStyle w:val="Heading1"/>
+      </w:pPr>
+      <w:r>
+        <w:t xml:space="preserve">Выводы</w:t>
       </w:r>
     </w:p>
     <w:p>
@@ -1040,311 +1011,10 @@
         <w:pStyle w:val="FirstParagraph"/>
       </w:pPr>
       <w:r>
-        <w:t xml:space="preserve">или</w:t>
-      </w:r>
-    </w:p>
-    <w:p>
-      <w:pPr>
-        <w:pStyle w:val="SourceCode"/>
-      </w:pPr>
-      <w:r>
-        <w:rPr>
-          <w:rStyle w:val="ExtensionTok"/>
-        </w:rPr>
-        <w:t xml:space="preserve">pdflatex</w:t>
-      </w:r>
-      <w:r>
-        <w:rPr>
-          <w:rStyle w:val="NormalTok"/>
-        </w:rPr>
-        <w:t xml:space="preserve"> first.tex</w:t>
-      </w:r>
-    </w:p>
-    <w:tbl>
-      <w:tblPr>
-        <w:tblStyle w:val="FigureTable"/>
-        <w:tblW w:type="auto" w:w="0"/>
-        <w:tblLook w:firstRow="0" w:lastRow="0" w:firstColumn="0" w:lastColumn="0"/>
-        <w:jc w:val="center"/>
-      </w:tblPr>
-      <w:tblGrid>
-        <w:gridCol w:w="7920"/>
-      </w:tblGrid>
-      <w:tr>
-        <w:tc>
-          <w:tcPr/>
-          <w:p>
-            <w:pPr>
-              <w:pStyle w:val="Compact"/>
-              <w:jc w:val="center"/>
-            </w:pPr>
-            <w:r>
-              <w:t xml:space="preserve">Рис.10</w:t>
-            </w:r>
-          </w:p>
-        </w:tc>
-      </w:tr>
-    </w:tbl>
-    <w:p>
-      <w:pPr>
-        <w:pStyle w:val="ImageCaption"/>
-      </w:pPr>
-      <w:r>
-        <w:t xml:space="preserve">Рис.10</w:t>
-      </w:r>
-    </w:p>
-    <w:p>
-      <w:pPr>
-        <w:numPr>
-          <w:ilvl w:val="0"/>
-          <w:numId w:val="1014"/>
-        </w:numPr>
-        <w:pStyle w:val="Compact"/>
-      </w:pPr>
-      <w:r>
-        <w:t xml:space="preserve">Освоить специальные символы LaTeX:</w:t>
-      </w:r>
-      <w:r>
-        <w:t xml:space="preserve"> </w:t>
-      </w:r>
-      <w:r>
-        <w:rPr>
-          <w:rStyle w:val="VerbatimChar"/>
-        </w:rPr>
-        <w:t xml:space="preserve">{</w:t>
-      </w:r>
-      <w:r>
-        <w:t xml:space="preserve">,</w:t>
-      </w:r>
-      <w:r>
-        <w:t xml:space="preserve"> </w:t>
-      </w:r>
-      <w:r>
-        <w:rPr>
-          <w:rStyle w:val="VerbatimChar"/>
-        </w:rPr>
-        <w:t xml:space="preserve">}</w:t>
-      </w:r>
-      <w:r>
-        <w:t xml:space="preserve">,</w:t>
-      </w:r>
-      <w:r>
-        <w:t xml:space="preserve"> </w:t>
-      </w:r>
-      <w:r>
-        <w:rPr>
-          <w:rStyle w:val="VerbatimChar"/>
-        </w:rPr>
-        <w:t xml:space="preserve">$</w:t>
-      </w:r>
-      <w:r>
-        <w:t xml:space="preserve">,</w:t>
-      </w:r>
-      <w:r>
-        <w:t xml:space="preserve"> </w:t>
-      </w:r>
-      <w:r>
-        <w:rPr>
-          <w:rStyle w:val="VerbatimChar"/>
-        </w:rPr>
-        <w:t xml:space="preserve">%</w:t>
-      </w:r>
-      <w:r>
-        <w:t xml:space="preserve">,</w:t>
-      </w:r>
-      <w:r>
-        <w:t xml:space="preserve"> </w:t>
-      </w:r>
-      <w:r>
-        <w:rPr>
-          <w:rStyle w:val="VerbatimChar"/>
-        </w:rPr>
-        <w:t xml:space="preserve">&amp;</w:t>
-      </w:r>
-      <w:r>
-        <w:t xml:space="preserve">,</w:t>
-      </w:r>
-      <w:r>
-        <w:t xml:space="preserve"> </w:t>
-      </w:r>
-      <w:r>
-        <w:rPr>
-          <w:rStyle w:val="VerbatimChar"/>
-        </w:rPr>
-        <w:t xml:space="preserve">#</w:t>
-      </w:r>
-      <w:r>
-        <w:t xml:space="preserve">,</w:t>
-      </w:r>
-      <w:r>
-        <w:t xml:space="preserve"> </w:t>
-      </w:r>
-      <w:r>
-        <w:rPr>
-          <w:rStyle w:val="VerbatimChar"/>
-        </w:rPr>
-        <w:t xml:space="preserve">_</w:t>
-      </w:r>
-      <w:r>
-        <w:t xml:space="preserve">,</w:t>
-      </w:r>
-      <w:r>
-        <w:t xml:space="preserve"> </w:t>
-      </w:r>
-      <w:r>
-        <w:rPr>
-          <w:rStyle w:val="VerbatimChar"/>
-        </w:rPr>
-        <w:t xml:space="preserve">\</w:t>
-      </w:r>
-      <w:r>
-        <w:t xml:space="preserve">,</w:t>
-      </w:r>
-      <w:r>
-        <w:t xml:space="preserve"> </w:t>
-      </w:r>
-      <w:r>
-        <w:rPr>
-          <w:rStyle w:val="VerbatimChar"/>
-        </w:rPr>
-        <w:t xml:space="preserve">^</w:t>
-      </w:r>
-      <w:r>
-        <w:t xml:space="preserve">,</w:t>
-      </w:r>
-      <w:r>
-        <w:t xml:space="preserve"> </w:t>
-      </w:r>
-      <w:r>
-        <w:rPr>
-          <w:rStyle w:val="VerbatimChar"/>
-        </w:rPr>
-        <w:t xml:space="preserve">~</w:t>
-      </w:r>
-      <w:r>
-        <w:t xml:space="preserve">.</w:t>
-      </w:r>
-    </w:p>
-    <w:tbl>
-      <w:tblPr>
-        <w:tblStyle w:val="FigureTable"/>
-        <w:tblW w:type="auto" w:w="0"/>
-        <w:tblLook w:firstRow="0" w:lastRow="0" w:firstColumn="0" w:lastColumn="0"/>
-        <w:jc w:val="center"/>
-      </w:tblPr>
-      <w:tblGrid>
-        <w:gridCol w:w="7920"/>
-      </w:tblGrid>
-      <w:tr>
-        <w:tc>
-          <w:tcPr/>
-          <w:p>
-            <w:pPr>
-              <w:pStyle w:val="Compact"/>
-              <w:jc w:val="center"/>
-            </w:pPr>
-            <w:r>
-              <w:t xml:space="preserve">Рис.11</w:t>
-            </w:r>
-          </w:p>
-        </w:tc>
-      </w:tr>
-    </w:tbl>
-    <w:p>
-      <w:pPr>
-        <w:pStyle w:val="ImageCaption"/>
-      </w:pPr>
-      <w:r>
-        <w:t xml:space="preserve">Рис.11</w:t>
-      </w:r>
-    </w:p>
-    <w:p>
-      <w:pPr>
-        <w:numPr>
-          <w:ilvl w:val="0"/>
-          <w:numId w:val="1015"/>
-        </w:numPr>
-        <w:pStyle w:val="Compact"/>
-      </w:pPr>
-      <w:r>
-        <w:t xml:space="preserve">Научиться правильно выводить их в тексте.</w:t>
-      </w:r>
-    </w:p>
-    <w:p>
-      <w:pPr>
-        <w:pStyle w:val="BlockText"/>
-      </w:pPr>
-      <w:r>
-        <w:t xml:space="preserve">В главе 2 отдельного раздела</w:t>
-      </w:r>
-      <w:r>
-        <w:t xml:space="preserve"> </w:t>
-      </w:r>
-      <w:r>
-        <w:rPr>
-          <w:rStyle w:val="VerbatimChar"/>
-        </w:rPr>
-        <w:t xml:space="preserve">Exercises</w:t>
-      </w:r>
-      <w:r>
-        <w:t xml:space="preserve"> </w:t>
-      </w:r>
-      <w:r>
-        <w:t xml:space="preserve">нет.</w:t>
-      </w:r>
-    </w:p>
-    <w:tbl>
-      <w:tblPr>
-        <w:tblStyle w:val="FigureTable"/>
-        <w:tblW w:type="auto" w:w="0"/>
-        <w:tblLook w:firstRow="0" w:lastRow="0" w:firstColumn="0" w:lastColumn="0"/>
-        <w:jc w:val="center"/>
-      </w:tblPr>
-      <w:tblGrid>
-        <w:gridCol w:w="7920"/>
-      </w:tblGrid>
-      <w:tr>
-        <w:tc>
-          <w:tcPr/>
-          <w:p>
-            <w:pPr>
-              <w:pStyle w:val="Compact"/>
-              <w:jc w:val="center"/>
-            </w:pPr>
-            <w:r>
-              <w:t xml:space="preserve">Рис.12</w:t>
-            </w:r>
-          </w:p>
-        </w:tc>
-      </w:tr>
-    </w:tbl>
-    <w:p>
-      <w:pPr>
-        <w:pStyle w:val="ImageCaption"/>
-      </w:pPr>
-      <w:r>
-        <w:t xml:space="preserve">Рис.12</w:t>
-      </w:r>
-    </w:p>
-    <w:bookmarkEnd w:id="47"/>
-    <w:bookmarkStart w:id="48" w:name="выводы"/>
-    <w:p>
-      <w:pPr>
-        <w:pStyle w:val="Heading1"/>
-      </w:pPr>
-      <w:r>
-        <w:t xml:space="preserve">Выводы</w:t>
-      </w:r>
-    </w:p>
-    <w:p>
-      <w:pPr>
-        <w:pStyle w:val="FirstParagraph"/>
-      </w:pPr>
-      <w:r>
         <w:t xml:space="preserve">Благодаря данной работе я изучила базовую структуру документа LaTeX и научилась компилировать его в PDF.</w:t>
       </w:r>
     </w:p>
-    <w:bookmarkEnd w:id="48"/>
+    <w:bookmarkEnd w:id="42"/>
     <w:sectPr/>
   </w:body>
 </w:document>
@@ -1612,176 +1282,6 @@
       </w:pPr>
     </w:lvl>
   </w:abstractNum>
-  <w:abstractNum w:abstractNumId="99412">
-    <w:nsid w:val="A99412"/>
-    <w:multiLevelType w:val="multilevel"/>
-    <w:lvl w:ilvl="0">
-      <w:start w:val="2"/>
-      <w:numFmt w:val="decimal"/>
-      <w:lvlText w:val="%1."/>
-      <w:lvlJc w:val="left"/>
-      <w:pPr>
-        <w:ind w:left="720" w:hanging="480"/>
-      </w:pPr>
-    </w:lvl>
-    <w:lvl w:ilvl="1">
-      <w:start w:val="2"/>
-      <w:numFmt w:val="decimal"/>
-      <w:lvlText w:val="%2."/>
-      <w:lvlJc w:val="left"/>
-      <w:pPr>
-        <w:ind w:left="1440" w:hanging="480"/>
-      </w:pPr>
-    </w:lvl>
-    <w:lvl w:ilvl="2">
-      <w:start w:val="2"/>
-      <w:numFmt w:val="decimal"/>
-      <w:lvlText w:val="%3."/>
-      <w:lvlJc w:val="left"/>
-      <w:pPr>
-        <w:ind w:left="2160" w:hanging="480"/>
-      </w:pPr>
-    </w:lvl>
-    <w:lvl w:ilvl="3">
-      <w:start w:val="2"/>
-      <w:numFmt w:val="decimal"/>
-      <w:lvlText w:val="%4."/>
-      <w:lvlJc w:val="left"/>
-      <w:pPr>
-        <w:ind w:left="2880" w:hanging="480"/>
-      </w:pPr>
-    </w:lvl>
-    <w:lvl w:ilvl="4">
-      <w:start w:val="2"/>
-      <w:numFmt w:val="decimal"/>
-      <w:lvlText w:val="%5."/>
-      <w:lvlJc w:val="left"/>
-      <w:pPr>
-        <w:ind w:left="3600" w:hanging="480"/>
-      </w:pPr>
-    </w:lvl>
-    <w:lvl w:ilvl="5">
-      <w:start w:val="2"/>
-      <w:numFmt w:val="decimal"/>
-      <w:lvlText w:val="%6."/>
-      <w:lvlJc w:val="left"/>
-      <w:pPr>
-        <w:ind w:left="4320" w:hanging="480"/>
-      </w:pPr>
-    </w:lvl>
-    <w:lvl w:ilvl="6">
-      <w:start w:val="2"/>
-      <w:numFmt w:val="decimal"/>
-      <w:lvlText w:val="%7."/>
-      <w:lvlJc w:val="left"/>
-      <w:pPr>
-        <w:ind w:left="5040" w:hanging="480"/>
-      </w:pPr>
-    </w:lvl>
-    <w:lvl w:ilvl="7">
-      <w:start w:val="2"/>
-      <w:numFmt w:val="decimal"/>
-      <w:lvlText w:val="%8."/>
-      <w:lvlJc w:val="left"/>
-      <w:pPr>
-        <w:ind w:left="5760" w:hanging="480"/>
-      </w:pPr>
-    </w:lvl>
-    <w:lvl w:ilvl="8">
-      <w:start w:val="2"/>
-      <w:numFmt w:val="decimal"/>
-      <w:lvlText w:val="%9."/>
-      <w:lvlJc w:val="left"/>
-      <w:pPr>
-        <w:ind w:left="6480" w:hanging="480"/>
-      </w:pPr>
-    </w:lvl>
-  </w:abstractNum>
-  <w:abstractNum w:abstractNumId="99413">
-    <w:nsid w:val="A99413"/>
-    <w:multiLevelType w:val="multilevel"/>
-    <w:lvl w:ilvl="0">
-      <w:start w:val="3"/>
-      <w:numFmt w:val="decimal"/>
-      <w:lvlText w:val="%1."/>
-      <w:lvlJc w:val="left"/>
-      <w:pPr>
-        <w:ind w:left="720" w:hanging="480"/>
-      </w:pPr>
-    </w:lvl>
-    <w:lvl w:ilvl="1">
-      <w:start w:val="3"/>
-      <w:numFmt w:val="decimal"/>
-      <w:lvlText w:val="%2."/>
-      <w:lvlJc w:val="left"/>
-      <w:pPr>
-        <w:ind w:left="1440" w:hanging="480"/>
-      </w:pPr>
-    </w:lvl>
-    <w:lvl w:ilvl="2">
-      <w:start w:val="3"/>
-      <w:numFmt w:val="decimal"/>
-      <w:lvlText w:val="%3."/>
-      <w:lvlJc w:val="left"/>
-      <w:pPr>
-        <w:ind w:left="2160" w:hanging="480"/>
-      </w:pPr>
-    </w:lvl>
-    <w:lvl w:ilvl="3">
-      <w:start w:val="3"/>
-      <w:numFmt w:val="decimal"/>
-      <w:lvlText w:val="%4."/>
-      <w:lvlJc w:val="left"/>
-      <w:pPr>
-        <w:ind w:left="2880" w:hanging="480"/>
-      </w:pPr>
-    </w:lvl>
-    <w:lvl w:ilvl="4">
-      <w:start w:val="3"/>
-      <w:numFmt w:val="decimal"/>
-      <w:lvlText w:val="%5."/>
-      <w:lvlJc w:val="left"/>
-      <w:pPr>
-        <w:ind w:left="3600" w:hanging="480"/>
-      </w:pPr>
-    </w:lvl>
-    <w:lvl w:ilvl="5">
-      <w:start w:val="3"/>
-      <w:numFmt w:val="decimal"/>
-      <w:lvlText w:val="%6."/>
-      <w:lvlJc w:val="left"/>
-      <w:pPr>
-        <w:ind w:left="4320" w:hanging="480"/>
-      </w:pPr>
-    </w:lvl>
-    <w:lvl w:ilvl="6">
-      <w:start w:val="3"/>
-      <w:numFmt w:val="decimal"/>
-      <w:lvlText w:val="%7."/>
-      <w:lvlJc w:val="left"/>
-      <w:pPr>
-        <w:ind w:left="5040" w:hanging="480"/>
-      </w:pPr>
-    </w:lvl>
-    <w:lvl w:ilvl="7">
-      <w:start w:val="3"/>
-      <w:numFmt w:val="decimal"/>
-      <w:lvlText w:val="%8."/>
-      <w:lvlJc w:val="left"/>
-      <w:pPr>
-        <w:ind w:left="5760" w:hanging="480"/>
-      </w:pPr>
-    </w:lvl>
-    <w:lvl w:ilvl="8">
-      <w:start w:val="3"/>
-      <w:numFmt w:val="decimal"/>
-      <w:lvlText w:val="%9."/>
-      <w:lvlJc w:val="left"/>
-      <w:pPr>
-        <w:ind w:left="6480" w:hanging="480"/>
-      </w:pPr>
-    </w:lvl>
-  </w:abstractNum>
   <w:abstractNum w:abstractNumId="99414">
     <w:nsid w:val="A99414"/>
     <w:multiLevelType w:val="multilevel"/>
@@ -1859,91 +1359,6 @@
     </w:lvl>
     <w:lvl w:ilvl="8">
       <w:start w:val="4"/>
-      <w:numFmt w:val="decimal"/>
-      <w:lvlText w:val="%9."/>
-      <w:lvlJc w:val="left"/>
-      <w:pPr>
-        <w:ind w:left="6480" w:hanging="480"/>
-      </w:pPr>
-    </w:lvl>
-  </w:abstractNum>
-  <w:abstractNum w:abstractNumId="99415">
-    <w:nsid w:val="A99415"/>
-    <w:multiLevelType w:val="multilevel"/>
-    <w:lvl w:ilvl="0">
-      <w:start w:val="5"/>
-      <w:numFmt w:val="decimal"/>
-      <w:lvlText w:val="%1."/>
-      <w:lvlJc w:val="left"/>
-      <w:pPr>
-        <w:ind w:left="720" w:hanging="480"/>
-      </w:pPr>
-    </w:lvl>
-    <w:lvl w:ilvl="1">
-      <w:start w:val="5"/>
-      <w:numFmt w:val="decimal"/>
-      <w:lvlText w:val="%2."/>
-      <w:lvlJc w:val="left"/>
-      <w:pPr>
-        <w:ind w:left="1440" w:hanging="480"/>
-      </w:pPr>
-    </w:lvl>
-    <w:lvl w:ilvl="2">
-      <w:start w:val="5"/>
-      <w:numFmt w:val="decimal"/>
-      <w:lvlText w:val="%3."/>
-      <w:lvlJc w:val="left"/>
-      <w:pPr>
-        <w:ind w:left="2160" w:hanging="480"/>
-      </w:pPr>
-    </w:lvl>
-    <w:lvl w:ilvl="3">
-      <w:start w:val="5"/>
-      <w:numFmt w:val="decimal"/>
-      <w:lvlText w:val="%4."/>
-      <w:lvlJc w:val="left"/>
-      <w:pPr>
-        <w:ind w:left="2880" w:hanging="480"/>
-      </w:pPr>
-    </w:lvl>
-    <w:lvl w:ilvl="4">
-      <w:start w:val="5"/>
-      <w:numFmt w:val="decimal"/>
-      <w:lvlText w:val="%5."/>
-      <w:lvlJc w:val="left"/>
-      <w:pPr>
-        <w:ind w:left="3600" w:hanging="480"/>
-      </w:pPr>
-    </w:lvl>
-    <w:lvl w:ilvl="5">
-      <w:start w:val="5"/>
-      <w:numFmt w:val="decimal"/>
-      <w:lvlText w:val="%6."/>
-      <w:lvlJc w:val="left"/>
-      <w:pPr>
-        <w:ind w:left="4320" w:hanging="480"/>
-      </w:pPr>
-    </w:lvl>
-    <w:lvl w:ilvl="6">
-      <w:start w:val="5"/>
-      <w:numFmt w:val="decimal"/>
-      <w:lvlText w:val="%7."/>
-      <w:lvlJc w:val="left"/>
-      <w:pPr>
-        <w:ind w:left="5040" w:hanging="480"/>
-      </w:pPr>
-    </w:lvl>
-    <w:lvl w:ilvl="7">
-      <w:start w:val="5"/>
-      <w:numFmt w:val="decimal"/>
-      <w:lvlText w:val="%8."/>
-      <w:lvlJc w:val="left"/>
-      <w:pPr>
-        <w:ind w:left="5760" w:hanging="480"/>
-      </w:pPr>
-    </w:lvl>
-    <w:lvl w:ilvl="8">
-      <w:start w:val="5"/>
       <w:numFmt w:val="decimal"/>
       <w:lvlText w:val="%9."/>
       <w:lvlJc w:val="left"/>
@@ -2037,91 +1452,6 @@
       </w:pPr>
     </w:lvl>
   </w:abstractNum>
-  <w:abstractNum w:abstractNumId="99417">
-    <w:nsid w:val="A99417"/>
-    <w:multiLevelType w:val="multilevel"/>
-    <w:lvl w:ilvl="0">
-      <w:start w:val="7"/>
-      <w:numFmt w:val="decimal"/>
-      <w:lvlText w:val="%1."/>
-      <w:lvlJc w:val="left"/>
-      <w:pPr>
-        <w:ind w:left="720" w:hanging="480"/>
-      </w:pPr>
-    </w:lvl>
-    <w:lvl w:ilvl="1">
-      <w:start w:val="7"/>
-      <w:numFmt w:val="decimal"/>
-      <w:lvlText w:val="%2."/>
-      <w:lvlJc w:val="left"/>
-      <w:pPr>
-        <w:ind w:left="1440" w:hanging="480"/>
-      </w:pPr>
-    </w:lvl>
-    <w:lvl w:ilvl="2">
-      <w:start w:val="7"/>
-      <w:numFmt w:val="decimal"/>
-      <w:lvlText w:val="%3."/>
-      <w:lvlJc w:val="left"/>
-      <w:pPr>
-        <w:ind w:left="2160" w:hanging="480"/>
-      </w:pPr>
-    </w:lvl>
-    <w:lvl w:ilvl="3">
-      <w:start w:val="7"/>
-      <w:numFmt w:val="decimal"/>
-      <w:lvlText w:val="%4."/>
-      <w:lvlJc w:val="left"/>
-      <w:pPr>
-        <w:ind w:left="2880" w:hanging="480"/>
-      </w:pPr>
-    </w:lvl>
-    <w:lvl w:ilvl="4">
-      <w:start w:val="7"/>
-      <w:numFmt w:val="decimal"/>
-      <w:lvlText w:val="%5."/>
-      <w:lvlJc w:val="left"/>
-      <w:pPr>
-        <w:ind w:left="3600" w:hanging="480"/>
-      </w:pPr>
-    </w:lvl>
-    <w:lvl w:ilvl="5">
-      <w:start w:val="7"/>
-      <w:numFmt w:val="decimal"/>
-      <w:lvlText w:val="%6."/>
-      <w:lvlJc w:val="left"/>
-      <w:pPr>
-        <w:ind w:left="4320" w:hanging="480"/>
-      </w:pPr>
-    </w:lvl>
-    <w:lvl w:ilvl="6">
-      <w:start w:val="7"/>
-      <w:numFmt w:val="decimal"/>
-      <w:lvlText w:val="%7."/>
-      <w:lvlJc w:val="left"/>
-      <w:pPr>
-        <w:ind w:left="5040" w:hanging="480"/>
-      </w:pPr>
-    </w:lvl>
-    <w:lvl w:ilvl="7">
-      <w:start w:val="7"/>
-      <w:numFmt w:val="decimal"/>
-      <w:lvlText w:val="%8."/>
-      <w:lvlJc w:val="left"/>
-      <w:pPr>
-        <w:ind w:left="5760" w:hanging="480"/>
-      </w:pPr>
-    </w:lvl>
-    <w:lvl w:ilvl="8">
-      <w:start w:val="7"/>
-      <w:numFmt w:val="decimal"/>
-      <w:lvlText w:val="%9."/>
-      <w:lvlJc w:val="left"/>
-      <w:pPr>
-        <w:ind w:left="6480" w:hanging="480"/>
-      </w:pPr>
-    </w:lvl>
-  </w:abstractNum>
   <w:abstractNum w:abstractNumId="99418">
     <w:nsid w:val="A99418"/>
     <w:multiLevelType w:val="multilevel"/>
@@ -2454,91 +1784,6 @@
     </w:lvl>
     <w:lvl w:ilvl="8">
       <w:start w:val="11"/>
-      <w:numFmt w:val="decimal"/>
-      <w:lvlText w:val="%9."/>
-      <w:lvlJc w:val="left"/>
-      <w:pPr>
-        <w:ind w:left="6480" w:hanging="480"/>
-      </w:pPr>
-    </w:lvl>
-  </w:abstractNum>
-  <w:abstractNum w:abstractNumId="994112">
-    <w:nsid w:val="A994112"/>
-    <w:multiLevelType w:val="multilevel"/>
-    <w:lvl w:ilvl="0">
-      <w:start w:val="12"/>
-      <w:numFmt w:val="decimal"/>
-      <w:lvlText w:val="%1."/>
-      <w:lvlJc w:val="left"/>
-      <w:pPr>
-        <w:ind w:left="720" w:hanging="480"/>
-      </w:pPr>
-    </w:lvl>
-    <w:lvl w:ilvl="1">
-      <w:start w:val="12"/>
-      <w:numFmt w:val="decimal"/>
-      <w:lvlText w:val="%2."/>
-      <w:lvlJc w:val="left"/>
-      <w:pPr>
-        <w:ind w:left="1440" w:hanging="480"/>
-      </w:pPr>
-    </w:lvl>
-    <w:lvl w:ilvl="2">
-      <w:start w:val="12"/>
-      <w:numFmt w:val="decimal"/>
-      <w:lvlText w:val="%3."/>
-      <w:lvlJc w:val="left"/>
-      <w:pPr>
-        <w:ind w:left="2160" w:hanging="480"/>
-      </w:pPr>
-    </w:lvl>
-    <w:lvl w:ilvl="3">
-      <w:start w:val="12"/>
-      <w:numFmt w:val="decimal"/>
-      <w:lvlText w:val="%4."/>
-      <w:lvlJc w:val="left"/>
-      <w:pPr>
-        <w:ind w:left="2880" w:hanging="480"/>
-      </w:pPr>
-    </w:lvl>
-    <w:lvl w:ilvl="4">
-      <w:start w:val="12"/>
-      <w:numFmt w:val="decimal"/>
-      <w:lvlText w:val="%5."/>
-      <w:lvlJc w:val="left"/>
-      <w:pPr>
-        <w:ind w:left="3600" w:hanging="480"/>
-      </w:pPr>
-    </w:lvl>
-    <w:lvl w:ilvl="5">
-      <w:start w:val="12"/>
-      <w:numFmt w:val="decimal"/>
-      <w:lvlText w:val="%6."/>
-      <w:lvlJc w:val="left"/>
-      <w:pPr>
-        <w:ind w:left="4320" w:hanging="480"/>
-      </w:pPr>
-    </w:lvl>
-    <w:lvl w:ilvl="6">
-      <w:start w:val="12"/>
-      <w:numFmt w:val="decimal"/>
-      <w:lvlText w:val="%7."/>
-      <w:lvlJc w:val="left"/>
-      <w:pPr>
-        <w:ind w:left="5040" w:hanging="480"/>
-      </w:pPr>
-    </w:lvl>
-    <w:lvl w:ilvl="7">
-      <w:start w:val="12"/>
-      <w:numFmt w:val="decimal"/>
-      <w:lvlText w:val="%8."/>
-      <w:lvlJc w:val="left"/>
-      <w:pPr>
-        <w:ind w:left="5760" w:hanging="480"/>
-      </w:pPr>
-    </w:lvl>
-    <w:lvl w:ilvl="8">
-      <w:start w:val="12"/>
       <w:numFmt w:val="decimal"/>
       <w:lvlText w:val="%9."/>
       <w:lvlJc w:val="left"/>
@@ -2584,69 +1829,9 @@
     </w:lvlOverride>
   </w:num>
   <w:num w:numId="1003">
-    <w:abstractNumId w:val="99412"/>
-    <w:lvlOverride w:ilvl="0">
-      <w:startOverride w:val="2"/>
-    </w:lvlOverride>
-    <w:lvlOverride w:ilvl="1">
-      <w:startOverride w:val="2"/>
-    </w:lvlOverride>
-    <w:lvlOverride w:ilvl="2">
-      <w:startOverride w:val="2"/>
-    </w:lvlOverride>
-    <w:lvlOverride w:ilvl="3">
-      <w:startOverride w:val="2"/>
-    </w:lvlOverride>
-    <w:lvlOverride w:ilvl="4">
-      <w:startOverride w:val="2"/>
-    </w:lvlOverride>
-    <w:lvlOverride w:ilvl="5">
-      <w:startOverride w:val="2"/>
-    </w:lvlOverride>
-    <w:lvlOverride w:ilvl="6">
-      <w:startOverride w:val="2"/>
-    </w:lvlOverride>
-    <w:lvlOverride w:ilvl="7">
-      <w:startOverride w:val="2"/>
-    </w:lvlOverride>
-    <w:lvlOverride w:ilvl="8">
-      <w:startOverride w:val="2"/>
-    </w:lvlOverride>
+    <w:abstractNumId w:val="991"/>
   </w:num>
   <w:num w:numId="1004">
-    <w:abstractNumId w:val="991"/>
-  </w:num>
-  <w:num w:numId="1005">
-    <w:abstractNumId w:val="99413"/>
-    <w:lvlOverride w:ilvl="0">
-      <w:startOverride w:val="3"/>
-    </w:lvlOverride>
-    <w:lvlOverride w:ilvl="1">
-      <w:startOverride w:val="3"/>
-    </w:lvlOverride>
-    <w:lvlOverride w:ilvl="2">
-      <w:startOverride w:val="3"/>
-    </w:lvlOverride>
-    <w:lvlOverride w:ilvl="3">
-      <w:startOverride w:val="3"/>
-    </w:lvlOverride>
-    <w:lvlOverride w:ilvl="4">
-      <w:startOverride w:val="3"/>
-    </w:lvlOverride>
-    <w:lvlOverride w:ilvl="5">
-      <w:startOverride w:val="3"/>
-    </w:lvlOverride>
-    <w:lvlOverride w:ilvl="6">
-      <w:startOverride w:val="3"/>
-    </w:lvlOverride>
-    <w:lvlOverride w:ilvl="7">
-      <w:startOverride w:val="3"/>
-    </w:lvlOverride>
-    <w:lvlOverride w:ilvl="8">
-      <w:startOverride w:val="3"/>
-    </w:lvlOverride>
-  </w:num>
-  <w:num w:numId="1006">
     <w:abstractNumId w:val="99414"/>
     <w:lvlOverride w:ilvl="0">
       <w:startOverride w:val="4"/>
@@ -2676,37 +1861,7 @@
       <w:startOverride w:val="4"/>
     </w:lvlOverride>
   </w:num>
-  <w:num w:numId="1007">
-    <w:abstractNumId w:val="99415"/>
-    <w:lvlOverride w:ilvl="0">
-      <w:startOverride w:val="5"/>
-    </w:lvlOverride>
-    <w:lvlOverride w:ilvl="1">
-      <w:startOverride w:val="5"/>
-    </w:lvlOverride>
-    <w:lvlOverride w:ilvl="2">
-      <w:startOverride w:val="5"/>
-    </w:lvlOverride>
-    <w:lvlOverride w:ilvl="3">
-      <w:startOverride w:val="5"/>
-    </w:lvlOverride>
-    <w:lvlOverride w:ilvl="4">
-      <w:startOverride w:val="5"/>
-    </w:lvlOverride>
-    <w:lvlOverride w:ilvl="5">
-      <w:startOverride w:val="5"/>
-    </w:lvlOverride>
-    <w:lvlOverride w:ilvl="6">
-      <w:startOverride w:val="5"/>
-    </w:lvlOverride>
-    <w:lvlOverride w:ilvl="7">
-      <w:startOverride w:val="5"/>
-    </w:lvlOverride>
-    <w:lvlOverride w:ilvl="8">
-      <w:startOverride w:val="5"/>
-    </w:lvlOverride>
-  </w:num>
-  <w:num w:numId="1008">
+  <w:num w:numId="1005">
     <w:abstractNumId w:val="99416"/>
     <w:lvlOverride w:ilvl="0">
       <w:startOverride w:val="6"/>
@@ -2736,40 +1891,10 @@
       <w:startOverride w:val="6"/>
     </w:lvlOverride>
   </w:num>
-  <w:num w:numId="1009">
+  <w:num w:numId="1006">
     <w:abstractNumId w:val="991"/>
   </w:num>
-  <w:num w:numId="1010">
-    <w:abstractNumId w:val="99417"/>
-    <w:lvlOverride w:ilvl="0">
-      <w:startOverride w:val="7"/>
-    </w:lvlOverride>
-    <w:lvlOverride w:ilvl="1">
-      <w:startOverride w:val="7"/>
-    </w:lvlOverride>
-    <w:lvlOverride w:ilvl="2">
-      <w:startOverride w:val="7"/>
-    </w:lvlOverride>
-    <w:lvlOverride w:ilvl="3">
-      <w:startOverride w:val="7"/>
-    </w:lvlOverride>
-    <w:lvlOverride w:ilvl="4">
-      <w:startOverride w:val="7"/>
-    </w:lvlOverride>
-    <w:lvlOverride w:ilvl="5">
-      <w:startOverride w:val="7"/>
-    </w:lvlOverride>
-    <w:lvlOverride w:ilvl="6">
-      <w:startOverride w:val="7"/>
-    </w:lvlOverride>
-    <w:lvlOverride w:ilvl="7">
-      <w:startOverride w:val="7"/>
-    </w:lvlOverride>
-    <w:lvlOverride w:ilvl="8">
-      <w:startOverride w:val="7"/>
-    </w:lvlOverride>
-  </w:num>
-  <w:num w:numId="1011">
+  <w:num w:numId="1007">
     <w:abstractNumId w:val="99418"/>
     <w:lvlOverride w:ilvl="0">
       <w:startOverride w:val="8"/>
@@ -2799,7 +1924,7 @@
       <w:startOverride w:val="8"/>
     </w:lvlOverride>
   </w:num>
-  <w:num w:numId="1012">
+  <w:num w:numId="1008">
     <w:abstractNumId w:val="99419"/>
     <w:lvlOverride w:ilvl="0">
       <w:startOverride w:val="9"/>
@@ -2829,7 +1954,7 @@
       <w:startOverride w:val="9"/>
     </w:lvlOverride>
   </w:num>
-  <w:num w:numId="1013">
+  <w:num w:numId="1009">
     <w:abstractNumId w:val="994110"/>
     <w:lvlOverride w:ilvl="0">
       <w:startOverride w:val="10"/>
@@ -2859,7 +1984,7 @@
       <w:startOverride w:val="10"/>
     </w:lvlOverride>
   </w:num>
-  <w:num w:numId="1014">
+  <w:num w:numId="1010">
     <w:abstractNumId w:val="994111"/>
     <w:lvlOverride w:ilvl="0">
       <w:startOverride w:val="11"/>
@@ -2887,36 +2012,6 @@
     </w:lvlOverride>
     <w:lvlOverride w:ilvl="8">
       <w:startOverride w:val="11"/>
-    </w:lvlOverride>
-  </w:num>
-  <w:num w:numId="1015">
-    <w:abstractNumId w:val="994112"/>
-    <w:lvlOverride w:ilvl="0">
-      <w:startOverride w:val="12"/>
-    </w:lvlOverride>
-    <w:lvlOverride w:ilvl="1">
-      <w:startOverride w:val="12"/>
-    </w:lvlOverride>
-    <w:lvlOverride w:ilvl="2">
-      <w:startOverride w:val="12"/>
-    </w:lvlOverride>
-    <w:lvlOverride w:ilvl="3">
-      <w:startOverride w:val="12"/>
-    </w:lvlOverride>
-    <w:lvlOverride w:ilvl="4">
-      <w:startOverride w:val="12"/>
-    </w:lvlOverride>
-    <w:lvlOverride w:ilvl="5">
-      <w:startOverride w:val="12"/>
-    </w:lvlOverride>
-    <w:lvlOverride w:ilvl="6">
-      <w:startOverride w:val="12"/>
-    </w:lvlOverride>
-    <w:lvlOverride w:ilvl="7">
-      <w:startOverride w:val="12"/>
-    </w:lvlOverride>
-    <w:lvlOverride w:ilvl="8">
-      <w:startOverride w:val="12"/>
     </w:lvlOverride>
   </w:num>
 </w:numbering>

</xml_diff>